<commit_message>
docs: update files for download
</commit_message>
<xml_diff>
--- a/src/files/CV-Mikita_Kanstantsinau(front-end).docx
+++ b/src/files/CV-Mikita_Kanstantsinau(front-end).docx
@@ -5,6 +5,7 @@
     <w:p>
       <w:pPr>
         <w:spacing w:after="0" w:line="240" w:lineRule="auto"/>
+        <w:jc w:val="center"/>
         <w:rPr>
           <w:rFonts w:ascii="Montserrat" w:hAnsi="Montserrat"/>
           <w:b/>
@@ -29,6 +30,7 @@
     <w:p>
       <w:pPr>
         <w:spacing w:after="120"/>
+        <w:jc w:val="center"/>
         <w:rPr>
           <w:rFonts w:ascii="Montserrat" w:hAnsi="Montserrat"/>
           <w:sz w:val="24"/>
@@ -43,25 +45,25 @@
           <w:szCs w:val="22"/>
           <w:lang w:val="en-US"/>
         </w:rPr>
-        <w:t>Angular</w:t>
+        <w:t>Frontend</w:t>
       </w:r>
       <w:r>
         <w:rPr>
           <w:rFonts w:ascii="Montserrat" w:hAnsi="Montserrat"/>
           <w:sz w:val="24"/>
           <w:szCs w:val="22"/>
-          <w:lang w:val="en-US"/>
-        </w:rPr>
-        <w:t xml:space="preserve"> </w:t>
+          <w:lang w:val="ru-RU"/>
+        </w:rPr>
+        <w:t>-</w:t>
       </w:r>
       <w:r>
         <w:rPr>
           <w:rFonts w:ascii="Montserrat" w:hAnsi="Montserrat"/>
           <w:sz w:val="24"/>
           <w:szCs w:val="22"/>
-          <w:lang w:val="en-US"/>
-        </w:rPr>
-        <w:t>Frontend</w:t>
+          <w:lang w:val="ru-RU"/>
+        </w:rPr>
+        <w:t>разработчик</w:t>
       </w:r>
       <w:r>
         <w:rPr>
@@ -70,7 +72,34 @@
           <w:szCs w:val="22"/>
           <w:lang w:val="ru-RU"/>
         </w:rPr>
-        <w:t xml:space="preserve"> разработчик</w:t>
+        <w:t xml:space="preserve"> (</w:t>
+      </w:r>
+      <w:r>
+        <w:rPr>
+          <w:rFonts w:ascii="Montserrat" w:hAnsi="Montserrat"/>
+          <w:sz w:val="24"/>
+          <w:szCs w:val="22"/>
+          <w:lang w:val="en-US"/>
+        </w:rPr>
+        <w:t>Angular</w:t>
+      </w:r>
+      <w:r>
+        <w:rPr>
+          <w:rFonts w:ascii="Montserrat" w:hAnsi="Montserrat"/>
+          <w:sz w:val="24"/>
+          <w:szCs w:val="22"/>
+          <w:lang w:val="en-US"/>
+        </w:rPr>
+        <w:t xml:space="preserve"> | React</w:t>
+      </w:r>
+      <w:r>
+        <w:rPr>
+          <w:rFonts w:ascii="Montserrat" w:hAnsi="Montserrat"/>
+          <w:sz w:val="24"/>
+          <w:szCs w:val="22"/>
+          <w:lang w:val="ru-RU"/>
+        </w:rPr>
+        <w:t>)</w:t>
       </w:r>
     </w:p>
     <w:p>
@@ -79,6 +108,7 @@
           <w:bottom w:val="single" w:sz="6" w:space="1" w:color="auto"/>
         </w:pBdr>
         <w:spacing w:after="0" w:line="240" w:lineRule="auto"/>
+        <w:jc w:val="center"/>
         <w:rPr>
           <w:rFonts w:ascii="Montserrat" w:hAnsi="Montserrat"/>
           <w:sz w:val="19"/>
@@ -93,7 +123,7 @@
           <w:szCs w:val="19"/>
           <w:lang w:val="ru-RU"/>
         </w:rPr>
-        <w:t>Батуми, Грузия</w:t>
+        <w:t>Гомель, Беларусь</w:t>
       </w:r>
       <w:r>
         <w:rPr>
@@ -102,7 +132,7 @@
           <w:szCs w:val="19"/>
           <w:lang w:val="ru-RU"/>
         </w:rPr>
-        <w:t xml:space="preserve"> | + 995 591 94 89 92</w:t>
+        <w:t xml:space="preserve"> </w:t>
       </w:r>
       <w:r>
         <w:rPr>
@@ -111,7 +141,7 @@
           <w:szCs w:val="19"/>
           <w:lang w:val="ru-RU"/>
         </w:rPr>
-        <w:t xml:space="preserve"> |</w:t>
+        <w:t>|</w:t>
       </w:r>
       <w:r>
         <w:rPr>
@@ -121,6 +151,87 @@
           <w:lang w:val="ru-RU"/>
         </w:rPr>
         <w:t xml:space="preserve"> </w:t>
+      </w:r>
+      <w:r>
+        <w:rPr>
+          <w:rFonts w:ascii="Montserrat" w:hAnsi="Montserrat"/>
+          <w:sz w:val="19"/>
+          <w:szCs w:val="19"/>
+          <w:lang w:val="ru-RU"/>
+        </w:rPr>
+        <w:t xml:space="preserve">+ </w:t>
+      </w:r>
+      <w:r>
+        <w:rPr>
+          <w:rFonts w:ascii="Montserrat" w:hAnsi="Montserrat"/>
+          <w:sz w:val="19"/>
+          <w:szCs w:val="19"/>
+          <w:lang w:val="ru-RU"/>
+        </w:rPr>
+        <w:t>375</w:t>
+      </w:r>
+      <w:r>
+        <w:rPr>
+          <w:rFonts w:ascii="Montserrat" w:hAnsi="Montserrat"/>
+          <w:sz w:val="19"/>
+          <w:szCs w:val="19"/>
+          <w:lang w:val="ru-RU"/>
+        </w:rPr>
+        <w:t xml:space="preserve"> </w:t>
+      </w:r>
+      <w:r>
+        <w:rPr>
+          <w:rFonts w:ascii="Montserrat" w:hAnsi="Montserrat"/>
+          <w:sz w:val="19"/>
+          <w:szCs w:val="19"/>
+          <w:lang w:val="ru-RU"/>
+        </w:rPr>
+        <w:t>29 113</w:t>
+      </w:r>
+      <w:r>
+        <w:rPr>
+          <w:rFonts w:ascii="Montserrat" w:hAnsi="Montserrat"/>
+          <w:sz w:val="19"/>
+          <w:szCs w:val="19"/>
+          <w:lang w:val="ru-RU"/>
+        </w:rPr>
+        <w:t xml:space="preserve"> </w:t>
+      </w:r>
+      <w:r>
+        <w:rPr>
+          <w:rFonts w:ascii="Montserrat" w:hAnsi="Montserrat"/>
+          <w:sz w:val="19"/>
+          <w:szCs w:val="19"/>
+          <w:lang w:val="ru-RU"/>
+        </w:rPr>
+        <w:t>79</w:t>
+      </w:r>
+      <w:r>
+        <w:rPr>
+          <w:rFonts w:ascii="Montserrat" w:hAnsi="Montserrat"/>
+          <w:sz w:val="19"/>
+          <w:szCs w:val="19"/>
+          <w:lang w:val="ru-RU"/>
+        </w:rPr>
+        <w:t xml:space="preserve"> </w:t>
+      </w:r>
+      <w:r>
+        <w:rPr>
+          <w:rFonts w:ascii="Montserrat" w:hAnsi="Montserrat"/>
+          <w:sz w:val="19"/>
+          <w:szCs w:val="19"/>
+          <w:lang w:val="ru-RU"/>
+        </w:rPr>
+        <w:t>14</w:t>
+      </w:r>
+      <w:r>
+        <w:rPr>
+          <w:rFonts w:ascii="Montserrat" w:hAnsi="Montserrat"/>
+          <w:sz w:val="19"/>
+          <w:szCs w:val="19"/>
+          <w:lang w:val="ru-RU"/>
+        </w:rPr>
+        <w:t xml:space="preserve"> | </w:t>
       </w:r>
       <w:hyperlink r:id="rId5" w:history="1">
         <w:r>
@@ -151,16 +262,7 @@
           <w:szCs w:val="19"/>
           <w:lang w:val="ru-RU"/>
         </w:rPr>
-        <w:t>|</w:t>
-      </w:r>
-      <w:r>
-        <w:rPr>
-          <w:rFonts w:ascii="Montserrat" w:hAnsi="Montserrat"/>
-          <w:sz w:val="19"/>
-          <w:szCs w:val="19"/>
-          <w:lang w:val="ru-RU"/>
-        </w:rPr>
-        <w:t xml:space="preserve"> </w:t>
+        <w:t xml:space="preserve">| </w:t>
       </w:r>
       <w:hyperlink r:id="rId6" w:history="1">
         <w:r>
@@ -292,16 +394,7 @@
           <w:szCs w:val="19"/>
           <w:lang w:val="ru-RU"/>
         </w:rPr>
-        <w:t>|</w:t>
-      </w:r>
-      <w:r>
-        <w:rPr>
-          <w:rFonts w:ascii="Montserrat" w:hAnsi="Montserrat"/>
-          <w:sz w:val="19"/>
-          <w:szCs w:val="19"/>
-          <w:lang w:val="ru-RU"/>
-        </w:rPr>
-        <w:t xml:space="preserve"> </w:t>
+        <w:t xml:space="preserve">| </w:t>
       </w:r>
       <w:hyperlink r:id="rId8" w:history="1">
         <w:r>
@@ -315,15 +408,6 @@
           <w:t>GitHub</w:t>
         </w:r>
       </w:hyperlink>
-      <w:r>
-        <w:rPr>
-          <w:rFonts w:ascii="Montserrat" w:hAnsi="Montserrat"/>
-          <w:sz w:val="19"/>
-          <w:szCs w:val="19"/>
-          <w:lang w:val="ru-RU"/>
-        </w:rPr>
-        <w:t xml:space="preserve"> </w:t>
-      </w:r>
     </w:p>
     <w:p>
       <w:pPr>
@@ -622,6 +706,15 @@
           <w:lang w:val="ru-RU"/>
         </w:rPr>
         <w:t>2</w:t>
+      </w:r>
+      <w:r>
+        <w:rPr>
+          <w:rFonts w:ascii="Montserrat" w:hAnsi="Montserrat"/>
+          <w:sz w:val="24"/>
+          <w:szCs w:val="24"/>
+          <w:lang w:val="en-US"/>
+        </w:rPr>
+        <w:t>,5</w:t>
       </w:r>
       <w:r>
         <w:rPr>
@@ -676,11 +769,12 @@
                 <w:rFonts w:ascii="Montserrat" w:hAnsi="Montserrat"/>
                 <w:b/>
                 <w:bCs/>
+                <w:sz w:val="24"/>
+                <w:szCs w:val="22"/>
                 <w:u w:val="single"/>
                 <w:lang w:val="en-US"/>
               </w:rPr>
             </w:pPr>
-            <w:proofErr w:type="spellStart"/>
             <w:r>
               <w:rPr>
                 <w:rFonts w:ascii="Montserrat" w:hAnsi="Montserrat"/>
@@ -691,32 +785,7 @@
                 <w:u w:val="single"/>
                 <w:lang w:val="en-US"/>
               </w:rPr>
-              <w:t>CommunityTech</w:t>
-            </w:r>
-            <w:proofErr w:type="spellEnd"/>
-            <w:r>
-              <w:rPr>
-                <w:rFonts w:ascii="Montserrat" w:hAnsi="Montserrat"/>
-                <w:b/>
-                <w:bCs/>
-                <w:sz w:val="24"/>
-                <w:szCs w:val="22"/>
-                <w:u w:val="single"/>
-                <w:lang w:val="en-US"/>
-              </w:rPr>
-              <w:t xml:space="preserve"> Group – Middle Front-end </w:t>
-            </w:r>
-            <w:r>
-              <w:rPr>
-                <w:rFonts w:ascii="Montserrat" w:hAnsi="Montserrat"/>
-                <w:b/>
-                <w:bCs/>
-                <w:sz w:val="24"/>
-                <w:szCs w:val="22"/>
-                <w:u w:val="single"/>
-                <w:lang w:val="ru-RU"/>
-              </w:rPr>
-              <w:t>разработчик</w:t>
+              <w:t>ShareBook – Front-end разработчик</w:t>
             </w:r>
           </w:p>
         </w:tc>
@@ -732,6 +801,92 @@
                 <w:rFonts w:ascii="Montserrat" w:hAnsi="Montserrat"/>
                 <w:b/>
                 <w:bCs/>
+                <w:sz w:val="24"/>
+                <w:szCs w:val="22"/>
+                <w:lang w:val="en-US"/>
+              </w:rPr>
+            </w:pPr>
+            <w:r>
+              <w:rPr>
+                <w:rFonts w:ascii="Montserrat" w:hAnsi="Montserrat"/>
+                <w:b/>
+                <w:bCs/>
+                <w:sz w:val="24"/>
+                <w:szCs w:val="22"/>
+                <w:lang w:val="en-US"/>
+              </w:rPr>
+              <w:t xml:space="preserve">04.2026 </w:t>
+            </w:r>
+            <w:r>
+              <w:rPr>
+                <w:rFonts w:ascii="Montserrat" w:hAnsi="Montserrat"/>
+                <w:b/>
+                <w:bCs/>
+                <w:sz w:val="24"/>
+                <w:szCs w:val="22"/>
+                <w:lang w:val="en-US"/>
+              </w:rPr>
+              <w:t>–</w:t>
+            </w:r>
+            <w:r>
+              <w:rPr>
+                <w:rFonts w:ascii="Montserrat" w:hAnsi="Montserrat"/>
+                <w:b/>
+                <w:bCs/>
+                <w:sz w:val="24"/>
+                <w:szCs w:val="22"/>
+                <w:lang w:val="en-US"/>
+              </w:rPr>
+              <w:t xml:space="preserve"> по н.в.</w:t>
+            </w:r>
+          </w:p>
+        </w:tc>
+      </w:tr>
+      <w:tr>
+        <w:trPr>
+          <w:trHeight w:val="246"/>
+        </w:trPr>
+        <w:tc>
+          <w:tcPr>
+            <w:tcW w:w="10348" w:type="dxa"/>
+            <w:gridSpan w:val="2"/>
+          </w:tcPr>
+          <w:p>
+            <w:pPr>
+              <w:jc w:val="both"/>
+              <w:rPr>
+                <w:rFonts w:ascii="Montserrat" w:hAnsi="Montserrat"/>
+              </w:rPr>
+            </w:pPr>
+            <w:r>
+              <w:rPr>
+                <w:rFonts w:ascii="Montserrat" w:hAnsi="Montserrat"/>
+                <w:b/>
+                <w:bCs/>
+              </w:rPr>
+              <w:t xml:space="preserve">Проект: </w:t>
+            </w:r>
+            <w:hyperlink r:id="rId9" w:history="1">
+              <w:r>
+                <w:rPr>
+                  <w:rStyle w:val="a3"/>
+                  <w:rFonts w:ascii="Montserrat" w:hAnsi="Montserrat"/>
+                </w:rPr>
+                <w:t>ShareBook</w:t>
+              </w:r>
+            </w:hyperlink>
+            <w:r>
+              <w:rPr>
+                <w:rFonts w:ascii="Montserrat" w:hAnsi="Montserrat"/>
+              </w:rPr>
+              <w:t xml:space="preserve"> (open-source)</w:t>
+            </w:r>
+          </w:p>
+          <w:p>
+            <w:pPr>
+              <w:jc w:val="both"/>
+              <w:rPr>
+                <w:rFonts w:ascii="Montserrat" w:hAnsi="Montserrat"/>
                 <w:lang w:val="ru-RU"/>
               </w:rPr>
             </w:pPr>
@@ -740,12 +895,211 @@
                 <w:rFonts w:ascii="Montserrat" w:hAnsi="Montserrat"/>
                 <w:b/>
                 <w:bCs/>
+                <w:lang w:val="ru-RU"/>
+              </w:rPr>
+              <w:t xml:space="preserve">Описание: </w:t>
+            </w:r>
+            <w:r>
+              <w:rPr>
+                <w:rFonts w:ascii="Montserrat" w:hAnsi="Montserrat"/>
+                <w:lang w:val="ru-RU"/>
+              </w:rPr>
+              <w:t>Платформа для обмена книгами (буккроссинг): обмен и безвозмездная отдача книг</w:t>
+            </w:r>
+          </w:p>
+          <w:p>
+            <w:pPr>
+              <w:jc w:val="both"/>
+              <w:rPr>
+                <w:rFonts w:ascii="Montserrat" w:hAnsi="Montserrat"/>
+                <w:lang w:val="en-US"/>
+              </w:rPr>
+            </w:pPr>
+            <w:r>
+              <w:rPr>
+                <w:rFonts w:ascii="Montserrat" w:hAnsi="Montserrat"/>
+                <w:b/>
+                <w:bCs/>
+                <w:lang w:val="ru-RU"/>
+              </w:rPr>
+              <w:t>Технологический</w:t>
+            </w:r>
+            <w:r>
+              <w:rPr>
+                <w:rFonts w:ascii="Montserrat" w:hAnsi="Montserrat"/>
+                <w:b/>
+                <w:bCs/>
+                <w:lang w:val="en-US"/>
+              </w:rPr>
+              <w:t xml:space="preserve"> </w:t>
+            </w:r>
+            <w:r>
+              <w:rPr>
+                <w:rFonts w:ascii="Montserrat" w:hAnsi="Montserrat"/>
+                <w:b/>
+                <w:bCs/>
+                <w:lang w:val="ru-RU"/>
+              </w:rPr>
+              <w:t>стек</w:t>
+            </w:r>
+            <w:r>
+              <w:rPr>
+                <w:rFonts w:ascii="Montserrat" w:hAnsi="Montserrat"/>
+                <w:b/>
+                <w:bCs/>
+                <w:lang w:val="en-US"/>
+              </w:rPr>
+              <w:t xml:space="preserve">: </w:t>
+            </w:r>
+            <w:r>
+              <w:rPr>
+                <w:rFonts w:ascii="Montserrat" w:hAnsi="Montserrat"/>
+                <w:lang w:val="en-US"/>
+              </w:rPr>
+              <w:t>Next.js, React, TypeScript, Redux Toolkit, RTK Query, SCSS Modules, next-intl, MSW, Zod, SVGR, Feature-Sliced Design</w:t>
+            </w:r>
+          </w:p>
+          <w:p>
+            <w:pPr>
+              <w:spacing w:line="276" w:lineRule="auto"/>
+              <w:jc w:val="both"/>
+              <w:rPr>
+                <w:rFonts w:ascii="Montserrat" w:hAnsi="Montserrat"/>
+                <w:b/>
+                <w:bCs/>
+                <w:lang w:val="ru-RU"/>
+              </w:rPr>
+            </w:pPr>
+            <w:r>
+              <w:rPr>
+                <w:rFonts w:ascii="Montserrat" w:hAnsi="Montserrat"/>
+                <w:b/>
+                <w:bCs/>
+                <w:lang w:val="ru-RU"/>
+              </w:rPr>
+              <w:t xml:space="preserve">Команда: </w:t>
+            </w:r>
+            <w:r>
+              <w:rPr>
+                <w:rFonts w:ascii="Montserrat" w:hAnsi="Montserrat"/>
+                <w:lang w:val="ru-RU"/>
+              </w:rPr>
+              <w:t>6 человек</w:t>
+            </w:r>
+          </w:p>
+          <w:p>
+            <w:pPr>
+              <w:pStyle w:val="a6"/>
+              <w:numPr>
+                <w:ilvl w:val="0"/>
+                <w:numId w:val="1"/>
+              </w:numPr>
+              <w:jc w:val="both"/>
+              <w:rPr>
+                <w:rFonts w:ascii="Montserrat" w:hAnsi="Montserrat"/>
+              </w:rPr>
+            </w:pPr>
+            <w:r>
+              <w:rPr>
+                <w:rFonts w:ascii="Montserrat" w:hAnsi="Montserrat"/>
+              </w:rPr>
+              <w:t>Перенёс страницы профиля на Next.js Server Components с интеграцией реального бэкенда.</w:t>
+            </w:r>
+          </w:p>
+          <w:p>
+            <w:pPr>
+              <w:pStyle w:val="a6"/>
+              <w:numPr>
+                <w:ilvl w:val="0"/>
+                <w:numId w:val="1"/>
+              </w:numPr>
+              <w:jc w:val="both"/>
+              <w:rPr>
+                <w:rFonts w:ascii="Montserrat" w:hAnsi="Montserrat"/>
+              </w:rPr>
+            </w:pPr>
+            <w:r>
+              <w:rPr>
+                <w:rFonts w:ascii="Montserrat" w:hAnsi="Montserrat"/>
+              </w:rPr>
+              <w:t>Разработал переиспользуемые виджеты (лента книг с грид-версткой и состояниями загрузки/ошибки/пустоты, шапка профиля) по методологии Feature-Sliced Design.</w:t>
+            </w:r>
+          </w:p>
+          <w:p>
+            <w:pPr>
+              <w:pStyle w:val="a6"/>
+              <w:numPr>
+                <w:ilvl w:val="0"/>
+                <w:numId w:val="1"/>
+              </w:numPr>
+              <w:jc w:val="both"/>
+              <w:rPr>
+                <w:rFonts w:ascii="Montserrat" w:hAnsi="Montserrat"/>
+              </w:rPr>
+            </w:pPr>
+            <w:r>
+              <w:rPr>
+                <w:rFonts w:ascii="Montserrat" w:hAnsi="Montserrat"/>
+              </w:rPr>
+              <w:t>Реализовал загрузку данных через RTK Query и моки MSW, вынес общие утилиты.</w:t>
+            </w:r>
+          </w:p>
+          <w:p>
+            <w:pPr>
+              <w:pStyle w:val="a6"/>
+              <w:numPr>
+                <w:ilvl w:val="0"/>
+                <w:numId w:val="1"/>
+              </w:numPr>
+              <w:jc w:val="both"/>
+              <w:rPr>
+                <w:rFonts w:ascii="Montserrat" w:hAnsi="Montserrat"/>
+                <w:szCs w:val="22"/>
+                <w:lang w:val="ru-RU"/>
+              </w:rPr>
+            </w:pPr>
+            <w:r>
+              <w:rPr>
+                <w:rFonts w:ascii="Montserrat" w:hAnsi="Montserrat"/>
+              </w:rPr>
+              <w:t>Заменил сторонние normalize/adaptive-библиотеки собственными SCSS-решениями.</w:t>
+            </w:r>
+          </w:p>
+          <w:p>
+            <w:pPr>
+              <w:spacing w:line="324" w:lineRule="auto"/>
+              <w:jc w:val="both"/>
+              <w:rPr>
+                <w:rFonts w:ascii="Montserrat" w:hAnsi="Montserrat"/>
+                <w:b/>
+                <w:bCs/>
                 <w:sz w:val="24"/>
                 <w:szCs w:val="22"/>
-                <w:lang w:val="en-US"/>
-              </w:rPr>
-              <w:t>06.</w:t>
-            </w:r>
+                <w:lang w:val="ru-RU"/>
+              </w:rPr>
+            </w:pPr>
+          </w:p>
+        </w:tc>
+      </w:tr>
+      <w:tr>
+        <w:trPr>
+          <w:trHeight w:val="246"/>
+        </w:trPr>
+        <w:tc>
+          <w:tcPr>
+            <w:tcW w:w="7372" w:type="dxa"/>
+          </w:tcPr>
+          <w:p>
+            <w:pPr>
+              <w:spacing w:line="324" w:lineRule="auto"/>
+              <w:rPr>
+                <w:rFonts w:ascii="Montserrat" w:hAnsi="Montserrat"/>
+                <w:b/>
+                <w:bCs/>
+                <w:u w:val="single"/>
+                <w:lang w:val="en-US"/>
+              </w:rPr>
+            </w:pPr>
             <w:r>
               <w:rPr>
                 <w:rFonts w:ascii="Montserrat" w:hAnsi="Montserrat"/>
@@ -753,9 +1107,10 @@
                 <w:bCs/>
                 <w:sz w:val="24"/>
                 <w:szCs w:val="22"/>
-                <w:lang w:val="en-US"/>
-              </w:rPr>
-              <w:t>2024 –</w:t>
+                <w:u w:val="single"/>
+                <w:lang w:val="en-US"/>
+              </w:rPr>
+              <w:t xml:space="preserve">CommunityTech Group – Middle Front-end </w:t>
             </w:r>
             <w:r>
               <w:rPr>
@@ -764,10 +1119,28 @@
                 <w:bCs/>
                 <w:sz w:val="24"/>
                 <w:szCs w:val="22"/>
-                <w:lang w:val="en-US"/>
-              </w:rPr>
-              <w:t xml:space="preserve"> </w:t>
-            </w:r>
+                <w:u w:val="single"/>
+                <w:lang w:val="ru-RU"/>
+              </w:rPr>
+              <w:t>разработчик</w:t>
+            </w:r>
+          </w:p>
+        </w:tc>
+        <w:tc>
+          <w:tcPr>
+            <w:tcW w:w="2976" w:type="dxa"/>
+          </w:tcPr>
+          <w:p>
+            <w:pPr>
+              <w:spacing w:line="324" w:lineRule="auto"/>
+              <w:jc w:val="right"/>
+              <w:rPr>
+                <w:rFonts w:ascii="Montserrat" w:hAnsi="Montserrat"/>
+                <w:b/>
+                <w:bCs/>
+                <w:lang w:val="ru-RU"/>
+              </w:rPr>
+            </w:pPr>
             <w:r>
               <w:rPr>
                 <w:rFonts w:ascii="Montserrat" w:hAnsi="Montserrat"/>
@@ -777,7 +1150,7 @@
                 <w:szCs w:val="22"/>
                 <w:lang w:val="en-US"/>
               </w:rPr>
-              <w:t>1</w:t>
+              <w:t xml:space="preserve">06.2024 – </w:t>
             </w:r>
             <w:r>
               <w:rPr>
@@ -788,29 +1161,7 @@
                 <w:szCs w:val="22"/>
                 <w:lang w:val="en-US"/>
               </w:rPr>
-              <w:t>2</w:t>
-            </w:r>
-            <w:r>
-              <w:rPr>
-                <w:rFonts w:ascii="Montserrat" w:hAnsi="Montserrat"/>
-                <w:b/>
-                <w:bCs/>
-                <w:sz w:val="24"/>
-                <w:szCs w:val="22"/>
-                <w:lang w:val="en-US"/>
-              </w:rPr>
-              <w:t>.</w:t>
-            </w:r>
-            <w:r>
-              <w:rPr>
-                <w:rFonts w:ascii="Montserrat" w:hAnsi="Montserrat"/>
-                <w:b/>
-                <w:bCs/>
-                <w:sz w:val="24"/>
-                <w:szCs w:val="22"/>
-                <w:lang w:val="en-US"/>
-              </w:rPr>
-              <w:t>2025</w:t>
+              <w:t>по н.в.</w:t>
             </w:r>
           </w:p>
         </w:tc>
@@ -837,100 +1188,86 @@
                 <w:b/>
                 <w:bCs/>
               </w:rPr>
-              <w:t>Проекты:</w:t>
-            </w:r>
-            <w:r>
-              <w:rPr>
-                <w:rFonts w:ascii="Montserrat" w:hAnsi="Montserrat"/>
-                <w:b/>
-                <w:bCs/>
+              <w:t xml:space="preserve">Проекты: </w:t>
+            </w:r>
+            <w:r>
+              <w:rPr>
+                <w:rFonts w:ascii="Montserrat" w:hAnsi="Montserrat"/>
+              </w:rPr>
+              <w:t>ClubFirst, ClubFirts Ladies, ClubFirst Future, Opora, Фонд Будущих Лидеров, НАУЗ, CTG, VQ</w:t>
+            </w:r>
+            <w:r>
+              <w:rPr>
+                <w:rFonts w:ascii="Montserrat" w:hAnsi="Montserrat"/>
+              </w:rPr>
+              <w:t>, ТНЭ team</w:t>
+            </w:r>
+          </w:p>
+          <w:p>
+            <w:pPr>
+              <w:jc w:val="both"/>
+              <w:rPr>
+                <w:rFonts w:ascii="Montserrat" w:hAnsi="Montserrat"/>
+                <w:lang w:val="ru-RU"/>
+              </w:rPr>
+            </w:pPr>
+            <w:r>
+              <w:rPr>
+                <w:rFonts w:ascii="Montserrat" w:hAnsi="Montserrat"/>
+                <w:b/>
+                <w:bCs/>
+                <w:lang w:val="ru-RU"/>
+              </w:rPr>
+              <w:t xml:space="preserve">Описание: </w:t>
+            </w:r>
+            <w:r>
+              <w:rPr>
+                <w:rFonts w:ascii="Montserrat" w:hAnsi="Montserrat"/>
+                <w:lang w:val="en-US"/>
+              </w:rPr>
+              <w:t>Web</w:t>
+            </w:r>
+            <w:r>
+              <w:rPr>
+                <w:rFonts w:ascii="Montserrat" w:hAnsi="Montserrat"/>
+                <w:lang w:val="ru-RU"/>
+              </w:rPr>
+              <w:t>-приложения для бизнес-сообществ</w:t>
+            </w:r>
+          </w:p>
+          <w:p>
+            <w:pPr>
+              <w:jc w:val="both"/>
+              <w:rPr>
+                <w:rFonts w:ascii="Montserrat" w:hAnsi="Montserrat"/>
+                <w:lang w:val="en-US"/>
+              </w:rPr>
+            </w:pPr>
+            <w:r>
+              <w:rPr>
+                <w:rFonts w:ascii="Montserrat" w:hAnsi="Montserrat"/>
+                <w:b/>
+                <w:bCs/>
+                <w:lang w:val="ru-RU"/>
+              </w:rPr>
+              <w:t>Технологический</w:t>
+            </w:r>
+            <w:r>
+              <w:rPr>
+                <w:rFonts w:ascii="Montserrat" w:hAnsi="Montserrat"/>
+                <w:b/>
+                <w:bCs/>
+                <w:lang w:val="en-US"/>
               </w:rPr>
               <w:t xml:space="preserve"> </w:t>
             </w:r>
             <w:r>
               <w:rPr>
                 <w:rFonts w:ascii="Montserrat" w:hAnsi="Montserrat"/>
-              </w:rPr>
-              <w:t>ClubFirst, ClubFirts Ladies, ClubFirst Future, Opora,</w:t>
-            </w:r>
-            <w:r>
-              <w:rPr>
-                <w:rFonts w:ascii="Montserrat" w:hAnsi="Montserrat"/>
-              </w:rPr>
-              <w:t xml:space="preserve"> Фонд Будущих Лидеров, НАУЗ, CTG, VQ</w:t>
-            </w:r>
-            <w:r>
-              <w:rPr>
-                <w:rFonts w:ascii="Montserrat" w:hAnsi="Montserrat"/>
-              </w:rPr>
-              <w:t>, ТНЭ team</w:t>
-            </w:r>
-          </w:p>
-          <w:p>
-            <w:pPr>
-              <w:jc w:val="both"/>
-              <w:rPr>
-                <w:rFonts w:ascii="Montserrat" w:hAnsi="Montserrat"/>
+                <w:b/>
+                <w:bCs/>
                 <w:lang w:val="ru-RU"/>
               </w:rPr>
-            </w:pPr>
-            <w:r>
-              <w:rPr>
-                <w:rFonts w:ascii="Montserrat" w:hAnsi="Montserrat"/>
-                <w:b/>
-                <w:bCs/>
-                <w:lang w:val="ru-RU"/>
-              </w:rPr>
-              <w:t xml:space="preserve">Описание: </w:t>
-            </w:r>
-            <w:r>
-              <w:rPr>
-                <w:rFonts w:ascii="Montserrat" w:hAnsi="Montserrat"/>
-                <w:lang w:val="en-US"/>
-              </w:rPr>
-              <w:t>Web</w:t>
-            </w:r>
-            <w:r>
-              <w:rPr>
-                <w:rFonts w:ascii="Montserrat" w:hAnsi="Montserrat"/>
-                <w:lang w:val="ru-RU"/>
-              </w:rPr>
-              <w:t>-приложения для бизнес-сообществ</w:t>
-            </w:r>
-          </w:p>
-          <w:p>
-            <w:pPr>
-              <w:jc w:val="both"/>
-              <w:rPr>
-                <w:rFonts w:ascii="Montserrat" w:hAnsi="Montserrat"/>
-                <w:lang w:val="en-US"/>
-              </w:rPr>
-            </w:pPr>
-            <w:r>
-              <w:rPr>
-                <w:rFonts w:ascii="Montserrat" w:hAnsi="Montserrat"/>
-                <w:b/>
-                <w:bCs/>
-                <w:lang w:val="ru-RU"/>
-              </w:rPr>
-              <w:t>Технологический</w:t>
-            </w:r>
-            <w:r>
-              <w:rPr>
-                <w:rFonts w:ascii="Montserrat" w:hAnsi="Montserrat"/>
-                <w:b/>
-                <w:bCs/>
-                <w:lang w:val="en-US"/>
-              </w:rPr>
-              <w:t xml:space="preserve"> </w:t>
-            </w:r>
-            <w:r>
-              <w:rPr>
-                <w:rFonts w:ascii="Montserrat" w:hAnsi="Montserrat"/>
-                <w:b/>
-                <w:bCs/>
-                <w:lang w:val="ru-RU"/>
-              </w:rPr>
               <w:t>стек</w:t>
             </w:r>
             <w:r>
@@ -947,76 +1284,7 @@
                 <w:rFonts w:ascii="Montserrat" w:hAnsi="Montserrat"/>
                 <w:lang w:val="en-US"/>
               </w:rPr>
-              <w:t xml:space="preserve">Angular, TypeScript, </w:t>
-            </w:r>
-            <w:proofErr w:type="spellStart"/>
-            <w:r>
-              <w:rPr>
-                <w:rFonts w:ascii="Montserrat" w:hAnsi="Montserrat"/>
-                <w:lang w:val="en-US"/>
-              </w:rPr>
-              <w:t>RxJS</w:t>
-            </w:r>
-            <w:proofErr w:type="spellEnd"/>
-            <w:r>
-              <w:rPr>
-                <w:rFonts w:ascii="Montserrat" w:hAnsi="Montserrat"/>
-                <w:lang w:val="en-US"/>
-              </w:rPr>
-              <w:t xml:space="preserve">, </w:t>
-            </w:r>
-            <w:proofErr w:type="spellStart"/>
-            <w:r>
-              <w:rPr>
-                <w:rFonts w:ascii="Montserrat" w:hAnsi="Montserrat"/>
-                <w:lang w:val="en-US"/>
-              </w:rPr>
-              <w:t>NgRX</w:t>
-            </w:r>
-            <w:proofErr w:type="spellEnd"/>
-            <w:r>
-              <w:rPr>
-                <w:rFonts w:ascii="Montserrat" w:hAnsi="Montserrat"/>
-                <w:lang w:val="en-US"/>
-              </w:rPr>
-              <w:t>, Angular Material, SCSS,</w:t>
-            </w:r>
-            <w:r>
-              <w:rPr>
-                <w:rFonts w:ascii="Montserrat" w:hAnsi="Montserrat"/>
-                <w:lang w:val="en-US"/>
-              </w:rPr>
-              <w:t xml:space="preserve"> REST API, </w:t>
-            </w:r>
-            <w:r>
-              <w:rPr>
-                <w:rFonts w:ascii="Montserrat" w:hAnsi="Montserrat"/>
-                <w:lang w:val="en-US"/>
-              </w:rPr>
-              <w:t xml:space="preserve">Swagger, Webpack, </w:t>
-            </w:r>
-            <w:proofErr w:type="spellStart"/>
-            <w:r>
-              <w:rPr>
-                <w:rFonts w:ascii="Montserrat" w:hAnsi="Montserrat"/>
-                <w:lang w:val="en-US"/>
-              </w:rPr>
-              <w:t>Npm</w:t>
-            </w:r>
-            <w:proofErr w:type="spellEnd"/>
-            <w:r>
-              <w:rPr>
-                <w:rFonts w:ascii="Montserrat" w:hAnsi="Montserrat"/>
-                <w:lang w:val="en-US"/>
-              </w:rPr>
-              <w:t>, CI/CD Gitlab, Agile, Scrum, Kanban</w:t>
-            </w:r>
-            <w:r>
-              <w:rPr>
-                <w:rFonts w:ascii="Montserrat" w:hAnsi="Montserrat"/>
-                <w:lang w:val="en-US"/>
-              </w:rPr>
-              <w:t>, Jira</w:t>
+              <w:t>Angular, TypeScript, RxJS, NgRX, Angular Material, SCSS, REST API, Swagger, Webpack, Npm, CI/CD Gitlab, Agile, Scrum, Kanban, Jira</w:t>
             </w:r>
           </w:p>
           <w:p>
@@ -1044,21 +1312,7 @@
                 <w:rFonts w:ascii="Montserrat" w:hAnsi="Montserrat"/>
                 <w:lang w:val="ru-RU"/>
               </w:rPr>
-              <w:t>1</w:t>
-            </w:r>
-            <w:r>
-              <w:rPr>
-                <w:rFonts w:ascii="Montserrat" w:hAnsi="Montserrat"/>
-                <w:lang w:val="ru-RU"/>
-              </w:rPr>
-              <w:t>4</w:t>
-            </w:r>
-            <w:r>
-              <w:rPr>
-                <w:rFonts w:ascii="Montserrat" w:hAnsi="Montserrat"/>
-                <w:lang w:val="ru-RU"/>
-              </w:rPr>
-              <w:t xml:space="preserve"> человек</w:t>
+              <w:t>14 человек</w:t>
             </w:r>
           </w:p>
           <w:p>
@@ -1299,94 +1553,8 @@
                 <w:szCs w:val="22"/>
                 <w:lang w:val="ru-RU"/>
               </w:rPr>
-              <w:t xml:space="preserve">Представлял </w:t>
-            </w:r>
-            <w:proofErr w:type="spellStart"/>
-            <w:r>
-              <w:rPr>
-                <w:rFonts w:ascii="Montserrat" w:hAnsi="Montserrat"/>
-                <w:szCs w:val="22"/>
-                <w:lang w:val="ru-RU"/>
-              </w:rPr>
-              <w:t>фронтенд</w:t>
-            </w:r>
-            <w:proofErr w:type="spellEnd"/>
-            <w:r>
-              <w:rPr>
-                <w:rFonts w:ascii="Montserrat" w:hAnsi="Montserrat"/>
-                <w:szCs w:val="22"/>
-                <w:lang w:val="ru-RU"/>
-              </w:rPr>
-              <w:t xml:space="preserve">-команду на </w:t>
-            </w:r>
-            <w:proofErr w:type="spellStart"/>
-            <w:r>
-              <w:rPr>
-                <w:rFonts w:ascii="Montserrat" w:hAnsi="Montserrat"/>
-                <w:szCs w:val="22"/>
-                <w:lang w:val="ru-RU"/>
-              </w:rPr>
-              <w:t>дейликах</w:t>
-            </w:r>
-            <w:proofErr w:type="spellEnd"/>
-            <w:r>
-              <w:rPr>
-                <w:rFonts w:ascii="Montserrat" w:hAnsi="Montserrat"/>
-                <w:szCs w:val="22"/>
-                <w:lang w:val="ru-RU"/>
-              </w:rPr>
-              <w:t xml:space="preserve">, </w:t>
-            </w:r>
-            <w:r>
-              <w:rPr>
-                <w:rFonts w:ascii="Montserrat" w:hAnsi="Montserrat"/>
-                <w:szCs w:val="22"/>
-                <w:lang w:val="ru-RU"/>
-              </w:rPr>
-              <w:t>выполнял</w:t>
-            </w:r>
-            <w:r>
-              <w:rPr>
-                <w:rFonts w:ascii="Montserrat" w:hAnsi="Montserrat"/>
-                <w:szCs w:val="22"/>
-                <w:lang w:val="ru-RU"/>
-              </w:rPr>
-              <w:t xml:space="preserve"> релиз</w:t>
-            </w:r>
-            <w:r>
-              <w:rPr>
-                <w:rFonts w:ascii="Montserrat" w:hAnsi="Montserrat"/>
-                <w:szCs w:val="22"/>
-                <w:lang w:val="ru-RU"/>
-              </w:rPr>
-              <w:t>ы</w:t>
-            </w:r>
-            <w:r>
-              <w:rPr>
-                <w:rFonts w:ascii="Montserrat" w:hAnsi="Montserrat"/>
-                <w:szCs w:val="22"/>
-                <w:lang w:val="ru-RU"/>
-              </w:rPr>
-              <w:t>, участвовал в планировании, оценке задач, обеспечивал синхронизацию с другими командами</w:t>
-            </w:r>
-            <w:r>
-              <w:rPr>
-                <w:rFonts w:ascii="Montserrat" w:hAnsi="Montserrat"/>
-                <w:szCs w:val="22"/>
-                <w:lang w:val="ru-RU"/>
-              </w:rPr>
-              <w:t>.</w:t>
-            </w:r>
-          </w:p>
-          <w:p>
-            <w:pPr>
-              <w:jc w:val="both"/>
-              <w:rPr>
-                <w:rFonts w:ascii="Montserrat" w:hAnsi="Montserrat"/>
-                <w:szCs w:val="22"/>
-                <w:lang w:val="ru-RU"/>
-              </w:rPr>
-            </w:pPr>
+              <w:t>Представлял фронтенд-команду на дейликах, выполнял релизы, участвовал в планировании, оценке задач, обеспечивал синхронизацию с другими командами.</w:t>
+            </w:r>
           </w:p>
         </w:tc>
       </w:tr>
@@ -1417,6 +1585,7 @@
                 <w:u w:val="single"/>
                 <w:lang w:val="ru-RU"/>
               </w:rPr>
+              <w:lastRenderedPageBreak/>
               <w:t xml:space="preserve">Фриланс – </w:t>
             </w:r>
             <w:r>
@@ -1530,8 +1699,7 @@
               </w:rPr>
               <w:t xml:space="preserve"> </w:t>
             </w:r>
-            <w:hyperlink r:id="rId9" w:history="1">
-              <w:proofErr w:type="spellStart"/>
+            <w:hyperlink r:id="rId10" w:history="1">
               <w:r>
                 <w:rPr>
                   <w:rStyle w:val="a3"/>
@@ -1541,7 +1709,6 @@
                 </w:rPr>
                 <w:t>cctv</w:t>
               </w:r>
-              <w:proofErr w:type="spellEnd"/>
               <w:r>
                 <w:rPr>
                   <w:rStyle w:val="a3"/>
@@ -1551,7 +1718,6 @@
                 </w:rPr>
                 <w:t>-</w:t>
               </w:r>
-              <w:proofErr w:type="spellStart"/>
               <w:r>
                 <w:rPr>
                   <w:rStyle w:val="a3"/>
@@ -1561,7 +1727,6 @@
                 </w:rPr>
                 <w:t>montaj</w:t>
               </w:r>
-              <w:proofErr w:type="spellEnd"/>
               <w:r>
                 <w:rPr>
                   <w:rStyle w:val="a3"/>
@@ -1571,7 +1736,6 @@
                 </w:rPr>
                 <w:t>.</w:t>
               </w:r>
-              <w:proofErr w:type="spellStart"/>
               <w:r>
                 <w:rPr>
                   <w:rStyle w:val="a3"/>
@@ -1581,7 +1745,6 @@
                 </w:rPr>
                 <w:t>ru</w:t>
               </w:r>
-              <w:proofErr w:type="spellEnd"/>
             </w:hyperlink>
           </w:p>
           <w:p>
@@ -1707,41 +1870,15 @@
                 <w:szCs w:val="22"/>
                 <w:lang w:val="ru-RU"/>
               </w:rPr>
-              <w:t xml:space="preserve">, </w:t>
-            </w:r>
-            <w:proofErr w:type="spellStart"/>
-            <w:r>
-              <w:rPr>
-                <w:rFonts w:ascii="Montserrat" w:hAnsi="Montserrat"/>
-                <w:szCs w:val="22"/>
-                <w:lang w:val="ru-RU"/>
-              </w:rPr>
-              <w:t>jQuery</w:t>
-            </w:r>
-            <w:proofErr w:type="spellEnd"/>
-            <w:r>
-              <w:rPr>
-                <w:rFonts w:ascii="Montserrat" w:hAnsi="Montserrat"/>
-                <w:szCs w:val="22"/>
-                <w:lang w:val="ru-RU"/>
-              </w:rPr>
-              <w:t xml:space="preserve">, </w:t>
-            </w:r>
-            <w:r>
-              <w:rPr>
-                <w:rFonts w:ascii="Montserrat" w:hAnsi="Montserrat"/>
-                <w:szCs w:val="22"/>
-                <w:lang w:val="en-US"/>
-              </w:rPr>
-              <w:t>P</w:t>
-            </w:r>
-            <w:r>
-              <w:rPr>
-                <w:rFonts w:ascii="Montserrat" w:hAnsi="Montserrat"/>
-                <w:szCs w:val="22"/>
-                <w:lang w:val="en-US"/>
-              </w:rPr>
-              <w:t>HP</w:t>
+              <w:t xml:space="preserve">, jQuery, </w:t>
+            </w:r>
+            <w:r>
+              <w:rPr>
+                <w:rFonts w:ascii="Montserrat" w:hAnsi="Montserrat"/>
+                <w:szCs w:val="22"/>
+                <w:lang w:val="en-US"/>
+              </w:rPr>
+              <w:t>PHP</w:t>
             </w:r>
           </w:p>
           <w:p>
@@ -1765,6 +1902,16 @@
               <w:t>Реализовал адаптивную верстку и интерактивные элементы (бургер-меню, поп-апы, формы с валидацией)</w:t>
             </w:r>
           </w:p>
+          <w:p>
+            <w:pPr>
+              <w:rPr>
+                <w:rFonts w:ascii="Montserrat" w:hAnsi="Montserrat"/>
+                <w:sz w:val="20"/>
+                <w:szCs w:val="18"/>
+                <w:lang w:val="ru-RU"/>
+              </w:rPr>
+            </w:pPr>
+          </w:p>
         </w:tc>
       </w:tr>
     </w:tbl>
@@ -1802,6 +1949,28 @@
         </w:rPr>
         <w:t>ОБРАЗОВАНИЕ</w:t>
       </w:r>
+      <w:r>
+        <w:rPr>
+          <w:rFonts w:ascii="Montserrat" w:hAnsi="Montserrat"/>
+          <w:b/>
+          <w:bCs/>
+          <w:sz w:val="28"/>
+          <w:szCs w:val="28"/>
+          <w:lang w:val="ru-RU"/>
+        </w:rPr>
+        <w:t xml:space="preserve"> (</w:t>
+      </w:r>
+      <w:r>
+        <w:rPr>
+          <w:rFonts w:ascii="Montserrat" w:hAnsi="Montserrat"/>
+          <w:b/>
+          <w:bCs/>
+          <w:sz w:val="28"/>
+          <w:szCs w:val="28"/>
+          <w:lang w:val="ru-RU"/>
+        </w:rPr>
+        <w:t>ВЫСШЕЕ)</w:t>
+      </w:r>
     </w:p>
     <w:p>
       <w:pPr>
@@ -1818,19 +1987,8 @@
           <w:bCs/>
           <w:lang w:val="ru-RU"/>
         </w:rPr>
-        <w:t xml:space="preserve">Гомельский государственный технический университет имени </w:t>
-      </w:r>
-      <w:proofErr w:type="spellStart"/>
-      <w:r>
-        <w:rPr>
-          <w:rFonts w:ascii="Montserrat" w:hAnsi="Montserrat"/>
-          <w:b/>
-          <w:bCs/>
-          <w:lang w:val="ru-RU"/>
-        </w:rPr>
-        <w:t>П.О.Сухого</w:t>
-      </w:r>
-      <w:proofErr w:type="spellEnd"/>
+        <w:t>Гомельский государственный технический университет имени П.О.Сухого</w:t>
+      </w:r>
       <w:r>
         <w:rPr>
           <w:rFonts w:ascii="Montserrat" w:hAnsi="Montserrat"/>
@@ -1973,23 +2131,7 @@
           <w:rFonts w:ascii="Montserrat" w:hAnsi="Montserrat"/>
           <w:lang w:val="en-US"/>
         </w:rPr>
-        <w:t xml:space="preserve"> «</w:t>
-      </w:r>
-      <w:proofErr w:type="spellStart"/>
-      <w:r>
-        <w:rPr>
-          <w:rFonts w:ascii="Montserrat" w:hAnsi="Montserrat"/>
-          <w:lang w:val="en-US"/>
-        </w:rPr>
-        <w:t>UpSkill</w:t>
-      </w:r>
-      <w:proofErr w:type="spellEnd"/>
-      <w:r>
-        <w:rPr>
-          <w:rFonts w:ascii="Montserrat" w:hAnsi="Montserrat"/>
-          <w:lang w:val="en-US"/>
-        </w:rPr>
-        <w:t xml:space="preserve"> Me»</w:t>
+        <w:t xml:space="preserve"> «UpSkill Me»</w:t>
       </w:r>
       <w:r>
         <w:rPr>
@@ -2191,105 +2333,21 @@
           <w:rFonts w:ascii="Montserrat" w:hAnsi="Montserrat"/>
           <w:lang w:val="en-US"/>
         </w:rPr>
-        <w:lastRenderedPageBreak/>
-        <w:t>HTML5, CSS3 (</w:t>
-      </w:r>
-      <w:r>
-        <w:rPr>
-          <w:rFonts w:ascii="Montserrat" w:hAnsi="Montserrat"/>
-          <w:lang w:val="en-US"/>
-        </w:rPr>
-        <w:t>SCSS, SASS, LESS)</w:t>
-      </w:r>
-      <w:r>
-        <w:rPr>
-          <w:rFonts w:ascii="Montserrat" w:hAnsi="Montserrat"/>
-          <w:lang w:val="en-US"/>
-        </w:rPr>
-        <w:t xml:space="preserve">, JavaScript, Angular 2+, TypeScript, </w:t>
-      </w:r>
-      <w:proofErr w:type="spellStart"/>
-      <w:r>
-        <w:rPr>
-          <w:rFonts w:ascii="Montserrat" w:hAnsi="Montserrat"/>
-          <w:lang w:val="en-US"/>
-        </w:rPr>
-        <w:t>RxJS</w:t>
-      </w:r>
-      <w:proofErr w:type="spellEnd"/>
-      <w:r>
-        <w:rPr>
-          <w:rFonts w:ascii="Montserrat" w:hAnsi="Montserrat"/>
-          <w:lang w:val="en-US"/>
-        </w:rPr>
-        <w:t xml:space="preserve">, </w:t>
-      </w:r>
-      <w:proofErr w:type="spellStart"/>
-      <w:r>
-        <w:rPr>
-          <w:rFonts w:ascii="Montserrat" w:hAnsi="Montserrat"/>
-          <w:lang w:val="en-US"/>
-        </w:rPr>
-        <w:t>NgRX</w:t>
-      </w:r>
-      <w:proofErr w:type="spellEnd"/>
-      <w:r>
-        <w:rPr>
-          <w:rFonts w:ascii="Montserrat" w:hAnsi="Montserrat"/>
-          <w:lang w:val="en-US"/>
-        </w:rPr>
-        <w:t>, Angular Material, WebSocket</w:t>
-      </w:r>
-      <w:r>
-        <w:rPr>
-          <w:rFonts w:ascii="Montserrat" w:hAnsi="Montserrat"/>
-          <w:lang w:val="en-US"/>
-        </w:rPr>
-        <w:t xml:space="preserve">, </w:t>
-      </w:r>
-      <w:r>
-        <w:rPr>
-          <w:rFonts w:ascii="Montserrat" w:hAnsi="Montserrat"/>
-          <w:lang w:val="en-US"/>
-        </w:rPr>
-        <w:t xml:space="preserve">Git, Webpack, GitLab CI/CD, Swagger, </w:t>
-      </w:r>
-      <w:proofErr w:type="spellStart"/>
-      <w:r>
-        <w:rPr>
-          <w:rFonts w:ascii="Montserrat" w:hAnsi="Montserrat"/>
-          <w:lang w:val="en-US"/>
-        </w:rPr>
-        <w:t>Npm</w:t>
-      </w:r>
-      <w:proofErr w:type="spellEnd"/>
-      <w:r>
-        <w:rPr>
-          <w:rFonts w:ascii="Montserrat" w:hAnsi="Montserrat"/>
-          <w:lang w:val="en-US"/>
-        </w:rPr>
-        <w:t xml:space="preserve">, </w:t>
-      </w:r>
-      <w:r>
-        <w:rPr>
-          <w:rFonts w:ascii="Montserrat" w:hAnsi="Montserrat"/>
-          <w:lang w:val="en-US"/>
-        </w:rPr>
-        <w:t>BEM, ООП, SOLID, FIRST, Agile (Scrum, Kanban)</w:t>
-      </w:r>
-      <w:r>
-        <w:rPr>
-          <w:rFonts w:ascii="Montserrat" w:hAnsi="Montserrat"/>
-          <w:lang w:val="en-US"/>
-        </w:rPr>
-        <w:t xml:space="preserve">, </w:t>
-      </w:r>
-      <w:r>
-        <w:rPr>
-          <w:rFonts w:ascii="Montserrat" w:hAnsi="Montserrat"/>
-          <w:lang w:val="en-US"/>
-        </w:rPr>
-        <w:t>Figma, Photoshop</w:t>
+        <w:t xml:space="preserve">HTML5, CSS3, JavaScript, TypeScript, Angular 2+, Angular Material, React, Next.js, RxJS, NgRX, Redux Toolkit / RTK Query, Zod, WebSocket, Swagger, MSW, SCSS, Tailwind CSS, SVGR, next-intl, Vitest, Jest, React Testing Library, Git, Vite, Webpack, Npm, GitLab CI/CD, Accessibility (a11y), Web Performance, Figma, Photoshop, Claude, Cursor, BEM, </w:t>
+      </w:r>
+      <w:r>
+        <w:rPr>
+          <w:rFonts w:ascii="Montserrat" w:hAnsi="Montserrat"/>
+          <w:lang w:val="ru-RU"/>
+        </w:rPr>
+        <w:t>ООП</w:t>
+      </w:r>
+      <w:r>
+        <w:rPr>
+          <w:rFonts w:ascii="Montserrat" w:hAnsi="Montserrat"/>
+          <w:lang w:val="en-US"/>
+        </w:rPr>
+        <w:t>, SOLID, FIRST, FSD, Agile (Scrum, Kanban)</w:t>
       </w:r>
     </w:p>
     <w:p>
@@ -2404,6 +2462,7 @@
     <w:p>
       <w:pPr>
         <w:spacing w:after="0" w:line="240" w:lineRule="auto"/>
+        <w:jc w:val="center"/>
         <w:rPr>
           <w:rFonts w:ascii="Montserrat" w:hAnsi="Montserrat"/>
           <w:b/>
@@ -2423,25 +2482,13 @@
           <w:lang w:val="en-US"/>
         </w:rPr>
         <w:lastRenderedPageBreak/>
-        <w:t xml:space="preserve">Mikita </w:t>
-      </w:r>
-      <w:proofErr w:type="spellStart"/>
-      <w:r>
-        <w:rPr>
-          <w:rFonts w:ascii="Montserrat" w:hAnsi="Montserrat"/>
-          <w:b/>
-          <w:bCs/>
-          <w:sz w:val="36"/>
-          <w:szCs w:val="32"/>
-          <w:lang w:val="en-US"/>
-        </w:rPr>
-        <w:t>Kanstantsinau</w:t>
-      </w:r>
-      <w:proofErr w:type="spellEnd"/>
+        <w:t>Mikita Kanstantsinau</w:t>
+      </w:r>
     </w:p>
     <w:p>
       <w:pPr>
         <w:spacing w:after="120"/>
+        <w:jc w:val="center"/>
         <w:rPr>
           <w:rFonts w:ascii="Montserrat" w:hAnsi="Montserrat"/>
           <w:sz w:val="24"/>
@@ -2456,7 +2503,7 @@
           <w:szCs w:val="22"/>
           <w:lang w:val="en-US"/>
         </w:rPr>
-        <w:t>Angular</w:t>
+        <w:t xml:space="preserve">Front-End Developer </w:t>
       </w:r>
       <w:r>
         <w:rPr>
@@ -2465,7 +2512,7 @@
           <w:szCs w:val="22"/>
           <w:lang w:val="en-US"/>
         </w:rPr>
-        <w:t xml:space="preserve"> </w:t>
+        <w:t>(</w:t>
       </w:r>
       <w:r>
         <w:rPr>
@@ -2474,7 +2521,7 @@
           <w:szCs w:val="22"/>
           <w:lang w:val="en-US"/>
         </w:rPr>
-        <w:t>Frontend</w:t>
+        <w:t>Angular</w:t>
       </w:r>
       <w:r>
         <w:rPr>
@@ -2483,7 +2530,16 @@
           <w:szCs w:val="22"/>
           <w:lang w:val="en-US"/>
         </w:rPr>
-        <w:t xml:space="preserve"> developer</w:t>
+        <w:t xml:space="preserve"> | React</w:t>
+      </w:r>
+      <w:r>
+        <w:rPr>
+          <w:rFonts w:ascii="Montserrat" w:hAnsi="Montserrat"/>
+          <w:sz w:val="24"/>
+          <w:szCs w:val="22"/>
+          <w:lang w:val="en-US"/>
+        </w:rPr>
+        <w:t>)</w:t>
       </w:r>
     </w:p>
     <w:p>
@@ -2492,6 +2548,7 @@
           <w:bottom w:val="single" w:sz="6" w:space="1" w:color="auto"/>
         </w:pBdr>
         <w:spacing w:after="0" w:line="240" w:lineRule="auto"/>
+        <w:jc w:val="center"/>
         <w:rPr>
           <w:rFonts w:ascii="Montserrat" w:hAnsi="Montserrat"/>
           <w:sz w:val="19"/>
@@ -2506,7 +2563,7 @@
           <w:szCs w:val="19"/>
           <w:lang w:val="en-US"/>
         </w:rPr>
-        <w:t>Batumi</w:t>
+        <w:t>Gomel</w:t>
       </w:r>
       <w:r>
         <w:rPr>
@@ -2524,7 +2581,7 @@
           <w:szCs w:val="19"/>
           <w:lang w:val="en-US"/>
         </w:rPr>
-        <w:t>Georgia</w:t>
+        <w:t>Belarus</w:t>
       </w:r>
       <w:r>
         <w:rPr>
@@ -2533,27 +2590,9 @@
           <w:szCs w:val="19"/>
           <w:lang w:val="en-US"/>
         </w:rPr>
-        <w:t xml:space="preserve"> | + 995 591 94 89 92 </w:t>
-      </w:r>
-      <w:r>
-        <w:rPr>
-          <w:rFonts w:ascii="Montserrat" w:hAnsi="Montserrat"/>
-          <w:sz w:val="19"/>
-          <w:szCs w:val="19"/>
-          <w:lang w:val="en-US"/>
-        </w:rPr>
-        <w:t>|</w:t>
-      </w:r>
-      <w:r>
-        <w:rPr>
-          <w:rFonts w:ascii="Montserrat" w:hAnsi="Montserrat"/>
-          <w:sz w:val="19"/>
-          <w:szCs w:val="19"/>
-          <w:lang w:val="en-US"/>
-        </w:rPr>
-        <w:t xml:space="preserve"> </w:t>
-      </w:r>
-      <w:hyperlink r:id="rId10" w:history="1">
+        <w:t xml:space="preserve"> | + 375 29 113 79 14 | </w:t>
+      </w:r>
+      <w:hyperlink r:id="rId11" w:history="1">
         <w:r>
           <w:rPr>
             <w:rStyle w:val="a3"/>
@@ -2567,20 +2606,24 @@
       </w:hyperlink>
       <w:r>
         <w:rPr>
-          <w:lang w:val="en-US"/>
-        </w:rPr>
-        <w:t xml:space="preserve"> </w:t>
-      </w:r>
-      <w:r>
-        <w:rPr>
+          <w:rStyle w:val="a3"/>
           <w:rFonts w:ascii="Montserrat" w:hAnsi="Montserrat"/>
           <w:sz w:val="19"/>
           <w:szCs w:val="19"/>
           <w:lang w:val="en-US"/>
         </w:rPr>
+        <w:t xml:space="preserve"> </w:t>
+      </w:r>
+      <w:r>
+        <w:rPr>
+          <w:rFonts w:ascii="Montserrat" w:hAnsi="Montserrat"/>
+          <w:sz w:val="19"/>
+          <w:szCs w:val="19"/>
+          <w:lang w:val="en-US"/>
+        </w:rPr>
         <w:t xml:space="preserve">| </w:t>
       </w:r>
-      <w:hyperlink r:id="rId11" w:history="1">
+      <w:hyperlink r:id="rId12" w:history="1">
         <w:r>
           <w:rPr>
             <w:rStyle w:val="a3"/>
@@ -2681,7 +2724,7 @@
         </w:rPr>
         <w:t xml:space="preserve"> | </w:t>
       </w:r>
-      <w:hyperlink r:id="rId12" w:history="1">
+      <w:hyperlink r:id="rId13" w:history="1">
         <w:r>
           <w:rPr>
             <w:rStyle w:val="a3"/>
@@ -2712,7 +2755,7 @@
         </w:rPr>
         <w:t xml:space="preserve">| </w:t>
       </w:r>
-      <w:hyperlink r:id="rId13" w:history="1">
+      <w:hyperlink r:id="rId14" w:history="1">
         <w:r>
           <w:rPr>
             <w:rStyle w:val="a3"/>
@@ -2805,20 +2848,7 @@
         <w:rPr>
           <w:rFonts w:ascii="Montserrat" w:hAnsi="Montserrat"/>
         </w:rPr>
-        <w:t>Delivered 40+ features (profiles, chats, events</w:t>
-      </w:r>
-      <w:r>
-        <w:rPr>
-          <w:rFonts w:ascii="Montserrat" w:hAnsi="Montserrat"/>
-          <w:lang w:val="ru-RU"/>
-        </w:rPr>
-        <w:t>ы</w:t>
-      </w:r>
-      <w:r>
-        <w:rPr>
-          <w:rFonts w:ascii="Montserrat" w:hAnsi="Montserrat"/>
-        </w:rPr>
-        <w:t>, billing, admin panels).</w:t>
+        <w:t>Delivered 40+ features (profiles, chats, events, billing, admin panels).</w:t>
       </w:r>
     </w:p>
     <w:p>
@@ -2941,6 +2971,15 @@
           <w:lang w:val="ru-RU"/>
         </w:rPr>
         <w:t>(2</w:t>
+      </w:r>
+      <w:r>
+        <w:rPr>
+          <w:rFonts w:ascii="Montserrat" w:hAnsi="Montserrat"/>
+          <w:sz w:val="24"/>
+          <w:szCs w:val="24"/>
+          <w:lang w:val="ru-RU"/>
+        </w:rPr>
+        <w:t>,5</w:t>
       </w:r>
       <w:r>
         <w:rPr>
@@ -3004,11 +3043,12 @@
                 <w:rFonts w:ascii="Montserrat" w:hAnsi="Montserrat"/>
                 <w:b/>
                 <w:bCs/>
+                <w:sz w:val="24"/>
+                <w:szCs w:val="22"/>
                 <w:u w:val="single"/>
                 <w:lang w:val="en-US"/>
               </w:rPr>
             </w:pPr>
-            <w:proofErr w:type="spellStart"/>
             <w:r>
               <w:rPr>
                 <w:rFonts w:ascii="Montserrat" w:hAnsi="Montserrat"/>
@@ -3019,9 +3059,8 @@
                 <w:u w:val="single"/>
                 <w:lang w:val="en-US"/>
               </w:rPr>
-              <w:t>CommunityTech</w:t>
-            </w:r>
-            <w:proofErr w:type="spellEnd"/>
+              <w:t xml:space="preserve">ShareBook – Front-end </w:t>
+            </w:r>
             <w:r>
               <w:rPr>
                 <w:rFonts w:ascii="Montserrat" w:hAnsi="Montserrat"/>
@@ -3032,9 +3071,8 @@
                 <w:u w:val="single"/>
                 <w:lang w:val="en-US"/>
               </w:rPr>
-              <w:t xml:space="preserve"> Group – </w:t>
-            </w:r>
-            <w:bookmarkStart w:id="1" w:name="_Hlk216704894"/>
+              <w:t>d</w:t>
+            </w:r>
             <w:r>
               <w:rPr>
                 <w:rFonts w:ascii="Montserrat" w:hAnsi="Montserrat"/>
@@ -3045,21 +3083,8 @@
                 <w:u w:val="single"/>
                 <w:lang w:val="en-US"/>
               </w:rPr>
-              <w:t xml:space="preserve">Middle Front-end </w:t>
-            </w:r>
-            <w:r>
-              <w:rPr>
-                <w:rFonts w:ascii="Montserrat" w:hAnsi="Montserrat"/>
-                <w:b/>
-                <w:bCs/>
-                <w:sz w:val="24"/>
-                <w:szCs w:val="22"/>
-                <w:u w:val="single"/>
-                <w:lang w:val="en-US"/>
-              </w:rPr>
-              <w:t>developer</w:t>
-            </w:r>
-            <w:bookmarkEnd w:id="1"/>
+              <w:t>eveloper</w:t>
+            </w:r>
           </w:p>
         </w:tc>
         <w:tc>
@@ -3074,8 +3099,349 @@
                 <w:rFonts w:ascii="Montserrat" w:hAnsi="Montserrat"/>
                 <w:b/>
                 <w:bCs/>
+                <w:sz w:val="24"/>
+                <w:szCs w:val="22"/>
+                <w:lang w:val="en-US"/>
+              </w:rPr>
+            </w:pPr>
+            <w:r>
+              <w:rPr>
+                <w:rFonts w:ascii="Montserrat" w:hAnsi="Montserrat"/>
+                <w:b/>
+                <w:bCs/>
+                <w:sz w:val="24"/>
+                <w:szCs w:val="22"/>
+                <w:lang w:val="en-US"/>
+              </w:rPr>
+              <w:t xml:space="preserve">04.2026 </w:t>
+            </w:r>
+            <w:r>
+              <w:rPr>
+                <w:rFonts w:ascii="Montserrat" w:hAnsi="Montserrat"/>
+                <w:b/>
+                <w:bCs/>
+                <w:sz w:val="24"/>
+                <w:szCs w:val="22"/>
+                <w:lang w:val="en-US"/>
+              </w:rPr>
+              <w:t>–</w:t>
+            </w:r>
+            <w:r>
+              <w:rPr>
+                <w:rFonts w:ascii="Montserrat" w:hAnsi="Montserrat"/>
+                <w:b/>
+                <w:bCs/>
+                <w:sz w:val="24"/>
+                <w:szCs w:val="22"/>
+                <w:lang w:val="en-US"/>
+              </w:rPr>
+              <w:t xml:space="preserve"> Present</w:t>
+            </w:r>
+          </w:p>
+        </w:tc>
+      </w:tr>
+      <w:tr>
+        <w:trPr>
+          <w:trHeight w:val="246"/>
+        </w:trPr>
+        <w:tc>
+          <w:tcPr>
+            <w:tcW w:w="10348" w:type="dxa"/>
+            <w:gridSpan w:val="2"/>
+          </w:tcPr>
+          <w:p>
+            <w:pPr>
+              <w:jc w:val="both"/>
+              <w:rPr>
+                <w:rFonts w:ascii="Montserrat" w:hAnsi="Montserrat"/>
+                <w:lang w:val="en-US"/>
+              </w:rPr>
+            </w:pPr>
+            <w:r>
+              <w:rPr>
+                <w:rFonts w:ascii="Montserrat" w:hAnsi="Montserrat"/>
+                <w:b/>
+                <w:bCs/>
+                <w:lang w:val="en-US"/>
+              </w:rPr>
+              <w:t>Projects</w:t>
+            </w:r>
+            <w:r>
+              <w:rPr>
+                <w:rFonts w:ascii="Montserrat" w:hAnsi="Montserrat"/>
+                <w:b/>
+                <w:bCs/>
+              </w:rPr>
+              <w:t xml:space="preserve">: </w:t>
+            </w:r>
+            <w:hyperlink r:id="rId15" w:history="1">
+              <w:r>
+                <w:rPr>
+                  <w:rStyle w:val="a3"/>
+                  <w:rFonts w:ascii="Montserrat" w:hAnsi="Montserrat"/>
+                </w:rPr>
+                <w:t>ShareBook</w:t>
+              </w:r>
+            </w:hyperlink>
+            <w:r>
+              <w:rPr>
+                <w:rFonts w:ascii="Montserrat" w:hAnsi="Montserrat"/>
+              </w:rPr>
+              <w:t xml:space="preserve"> (open-source)</w:t>
+            </w:r>
+          </w:p>
+          <w:p>
+            <w:pPr>
+              <w:jc w:val="both"/>
+              <w:rPr>
+                <w:rFonts w:ascii="Montserrat" w:hAnsi="Montserrat"/>
+                <w:lang w:val="en-US"/>
+              </w:rPr>
+            </w:pPr>
+            <w:r>
+              <w:rPr>
+                <w:rFonts w:ascii="Montserrat" w:hAnsi="Montserrat"/>
+                <w:b/>
+                <w:bCs/>
+                <w:lang w:val="en-US"/>
+              </w:rPr>
+              <w:t xml:space="preserve">Description: </w:t>
+            </w:r>
+            <w:r>
+              <w:rPr>
+                <w:rFonts w:ascii="Montserrat" w:hAnsi="Montserrat"/>
+                <w:lang w:val="en-US"/>
+              </w:rPr>
+              <w:t>Book-sharing (bookcrossing) platform for exchanging and giving away books</w:t>
+            </w:r>
+          </w:p>
+          <w:p>
+            <w:pPr>
+              <w:jc w:val="both"/>
+              <w:rPr>
+                <w:rFonts w:ascii="Montserrat" w:hAnsi="Montserrat"/>
+                <w:lang w:val="en-US"/>
+              </w:rPr>
+            </w:pPr>
+            <w:r>
+              <w:rPr>
+                <w:rFonts w:ascii="Montserrat" w:hAnsi="Montserrat"/>
+                <w:b/>
+                <w:bCs/>
+                <w:lang w:val="en-US"/>
+              </w:rPr>
+              <w:t xml:space="preserve">Tech stack: </w:t>
+            </w:r>
+            <w:r>
+              <w:rPr>
+                <w:rFonts w:ascii="Montserrat" w:hAnsi="Montserrat"/>
+                <w:lang w:val="en-US"/>
+              </w:rPr>
+              <w:t>Next.js, React, TypeScript, Redux Toolkit, RTK Query, SCSS Modules, next-intl, MSW, Zod, SVGR, Feature-Sliced Design</w:t>
+            </w:r>
+          </w:p>
+          <w:p>
+            <w:pPr>
+              <w:spacing w:line="276" w:lineRule="auto"/>
+              <w:jc w:val="both"/>
+              <w:rPr>
+                <w:rFonts w:ascii="Montserrat" w:hAnsi="Montserrat"/>
+                <w:b/>
+                <w:bCs/>
+                <w:lang w:val="en-US"/>
+              </w:rPr>
+            </w:pPr>
+            <w:r>
+              <w:rPr>
+                <w:rFonts w:ascii="Montserrat" w:hAnsi="Montserrat"/>
+                <w:b/>
+                <w:bCs/>
+                <w:lang w:val="en-US"/>
+              </w:rPr>
+              <w:t>Team</w:t>
+            </w:r>
+            <w:r>
+              <w:rPr>
+                <w:rFonts w:ascii="Montserrat" w:hAnsi="Montserrat"/>
+                <w:b/>
+                <w:bCs/>
                 <w:lang w:val="ru-RU"/>
               </w:rPr>
+              <w:t xml:space="preserve">: </w:t>
+            </w:r>
+            <w:r>
+              <w:rPr>
+                <w:rFonts w:ascii="Montserrat" w:hAnsi="Montserrat"/>
+                <w:lang w:val="ru-RU"/>
+              </w:rPr>
+              <w:t>6 members</w:t>
+            </w:r>
+          </w:p>
+          <w:p>
+            <w:pPr>
+              <w:pStyle w:val="a6"/>
+              <w:numPr>
+                <w:ilvl w:val="0"/>
+                <w:numId w:val="1"/>
+              </w:numPr>
+              <w:jc w:val="both"/>
+              <w:rPr>
+                <w:rFonts w:ascii="Montserrat" w:hAnsi="Montserrat"/>
+              </w:rPr>
+            </w:pPr>
+            <w:r>
+              <w:rPr>
+                <w:rFonts w:ascii="Montserrat" w:hAnsi="Montserrat"/>
+              </w:rPr>
+              <w:t>Migrated profile pages to Next.js Server Components integrated with the real backend.</w:t>
+            </w:r>
+          </w:p>
+          <w:p>
+            <w:pPr>
+              <w:pStyle w:val="a6"/>
+              <w:numPr>
+                <w:ilvl w:val="0"/>
+                <w:numId w:val="1"/>
+              </w:numPr>
+              <w:jc w:val="both"/>
+              <w:rPr>
+                <w:rFonts w:ascii="Montserrat" w:hAnsi="Montserrat"/>
+              </w:rPr>
+            </w:pPr>
+            <w:r>
+              <w:rPr>
+                <w:rFonts w:ascii="Montserrat" w:hAnsi="Montserrat"/>
+              </w:rPr>
+              <w:t>Built reusable widgets (book feed with grid and loading/error/empty states, profile header) following Feature-Sliced Design.</w:t>
+            </w:r>
+          </w:p>
+          <w:p>
+            <w:pPr>
+              <w:pStyle w:val="a6"/>
+              <w:numPr>
+                <w:ilvl w:val="0"/>
+                <w:numId w:val="1"/>
+              </w:numPr>
+              <w:jc w:val="both"/>
+              <w:rPr>
+                <w:rFonts w:ascii="Montserrat" w:hAnsi="Montserrat"/>
+              </w:rPr>
+            </w:pPr>
+            <w:r>
+              <w:rPr>
+                <w:rFonts w:ascii="Montserrat" w:hAnsi="Montserrat"/>
+              </w:rPr>
+              <w:t>Implemented data fetching with RTK Query and MSW mocks, and extracted shared utilities.</w:t>
+            </w:r>
+          </w:p>
+          <w:p>
+            <w:pPr>
+              <w:pStyle w:val="a6"/>
+              <w:numPr>
+                <w:ilvl w:val="0"/>
+                <w:numId w:val="1"/>
+              </w:numPr>
+              <w:jc w:val="both"/>
+              <w:rPr>
+                <w:rFonts w:ascii="Montserrat" w:hAnsi="Montserrat"/>
+              </w:rPr>
+            </w:pPr>
+            <w:r>
+              <w:rPr>
+                <w:rFonts w:ascii="Montserrat" w:hAnsi="Montserrat"/>
+              </w:rPr>
+              <w:t>Replaced third-party normalize/adaptive libraries with custom SCSS solutions.</w:t>
+            </w:r>
+          </w:p>
+          <w:p>
+            <w:pPr>
+              <w:spacing w:line="324" w:lineRule="auto"/>
+              <w:jc w:val="both"/>
+              <w:rPr>
+                <w:rFonts w:ascii="Montserrat" w:hAnsi="Montserrat"/>
+                <w:b/>
+                <w:bCs/>
+                <w:sz w:val="24"/>
+                <w:szCs w:val="22"/>
+                <w:lang w:val="en-US"/>
+              </w:rPr>
+            </w:pPr>
+          </w:p>
+        </w:tc>
+      </w:tr>
+      <w:tr>
+        <w:trPr>
+          <w:trHeight w:val="246"/>
+        </w:trPr>
+        <w:tc>
+          <w:tcPr>
+            <w:tcW w:w="7372" w:type="dxa"/>
+          </w:tcPr>
+          <w:p>
+            <w:pPr>
+              <w:spacing w:line="324" w:lineRule="auto"/>
+              <w:rPr>
+                <w:rFonts w:ascii="Montserrat" w:hAnsi="Montserrat"/>
+                <w:b/>
+                <w:bCs/>
+                <w:u w:val="single"/>
+                <w:lang w:val="en-US"/>
+              </w:rPr>
+            </w:pPr>
+            <w:r>
+              <w:rPr>
+                <w:rFonts w:ascii="Montserrat" w:hAnsi="Montserrat"/>
+                <w:b/>
+                <w:bCs/>
+                <w:sz w:val="24"/>
+                <w:szCs w:val="22"/>
+                <w:u w:val="single"/>
+                <w:lang w:val="en-US"/>
+              </w:rPr>
+              <w:t xml:space="preserve">CommunityTech Group – </w:t>
+            </w:r>
+            <w:bookmarkStart w:id="1" w:name="_Hlk216704894"/>
+            <w:r>
+              <w:rPr>
+                <w:rFonts w:ascii="Montserrat" w:hAnsi="Montserrat"/>
+                <w:b/>
+                <w:bCs/>
+                <w:sz w:val="24"/>
+                <w:szCs w:val="22"/>
+                <w:u w:val="single"/>
+                <w:lang w:val="en-US"/>
+              </w:rPr>
+              <w:t xml:space="preserve">Middle Front-end </w:t>
+            </w:r>
+            <w:r>
+              <w:rPr>
+                <w:rFonts w:ascii="Montserrat" w:hAnsi="Montserrat"/>
+                <w:b/>
+                <w:bCs/>
+                <w:sz w:val="24"/>
+                <w:szCs w:val="22"/>
+                <w:u w:val="single"/>
+                <w:lang w:val="en-US"/>
+              </w:rPr>
+              <w:t>developer</w:t>
+            </w:r>
+            <w:bookmarkEnd w:id="1"/>
+          </w:p>
+        </w:tc>
+        <w:tc>
+          <w:tcPr>
+            <w:tcW w:w="2976" w:type="dxa"/>
+          </w:tcPr>
+          <w:p>
+            <w:pPr>
+              <w:spacing w:line="324" w:lineRule="auto"/>
+              <w:jc w:val="right"/>
+              <w:rPr>
+                <w:rFonts w:ascii="Montserrat" w:hAnsi="Montserrat"/>
+                <w:b/>
+                <w:bCs/>
+                <w:lang w:val="ru-RU"/>
+              </w:rPr>
             </w:pPr>
             <w:bookmarkStart w:id="2" w:name="OLE_LINK3"/>
             <w:r>
@@ -3099,7 +3465,7 @@
                 <w:szCs w:val="22"/>
                 <w:lang w:val="en-US"/>
               </w:rPr>
-              <w:t xml:space="preserve"> – 1</w:t>
+              <w:t xml:space="preserve"> – </w:t>
             </w:r>
             <w:r>
               <w:rPr>
@@ -3110,18 +3476,7 @@
                 <w:szCs w:val="22"/>
                 <w:lang w:val="en-US"/>
               </w:rPr>
-              <w:t>2</w:t>
-            </w:r>
-            <w:r>
-              <w:rPr>
-                <w:rFonts w:ascii="Montserrat" w:hAnsi="Montserrat"/>
-                <w:b/>
-                <w:bCs/>
-                <w:sz w:val="24"/>
-                <w:szCs w:val="22"/>
-                <w:lang w:val="en-US"/>
-              </w:rPr>
-              <w:t>.2025</w:t>
+              <w:t>Present</w:t>
             </w:r>
           </w:p>
         </w:tc>
@@ -3274,55 +3629,7 @@
                 <w:rFonts w:ascii="Montserrat" w:hAnsi="Montserrat"/>
                 <w:lang w:val="en-US"/>
               </w:rPr>
-              <w:t xml:space="preserve">Angular, TypeScript, </w:t>
-            </w:r>
-            <w:proofErr w:type="spellStart"/>
-            <w:r>
-              <w:rPr>
-                <w:rFonts w:ascii="Montserrat" w:hAnsi="Montserrat"/>
-                <w:lang w:val="en-US"/>
-              </w:rPr>
-              <w:t>RxJS</w:t>
-            </w:r>
-            <w:proofErr w:type="spellEnd"/>
-            <w:r>
-              <w:rPr>
-                <w:rFonts w:ascii="Montserrat" w:hAnsi="Montserrat"/>
-                <w:lang w:val="en-US"/>
-              </w:rPr>
-              <w:t xml:space="preserve">, </w:t>
-            </w:r>
-            <w:proofErr w:type="spellStart"/>
-            <w:r>
-              <w:rPr>
-                <w:rFonts w:ascii="Montserrat" w:hAnsi="Montserrat"/>
-                <w:lang w:val="en-US"/>
-              </w:rPr>
-              <w:t>NgRX</w:t>
-            </w:r>
-            <w:proofErr w:type="spellEnd"/>
-            <w:r>
-              <w:rPr>
-                <w:rFonts w:ascii="Montserrat" w:hAnsi="Montserrat"/>
-                <w:lang w:val="en-US"/>
-              </w:rPr>
-              <w:t xml:space="preserve">, Angular Material, SCSS, REST API, Swagger, Webpack, </w:t>
-            </w:r>
-            <w:proofErr w:type="spellStart"/>
-            <w:r>
-              <w:rPr>
-                <w:rFonts w:ascii="Montserrat" w:hAnsi="Montserrat"/>
-                <w:lang w:val="en-US"/>
-              </w:rPr>
-              <w:t>Npm</w:t>
-            </w:r>
-            <w:proofErr w:type="spellEnd"/>
-            <w:r>
-              <w:rPr>
-                <w:rFonts w:ascii="Montserrat" w:hAnsi="Montserrat"/>
-                <w:lang w:val="en-US"/>
-              </w:rPr>
-              <w:t>, CI/CD Gitlab, Agile, Scrum, Kanban, Jira</w:t>
+              <w:t>Angular, TypeScript, RxJS, NgRX, Angular Material, SCSS, REST API, Swagger, Webpack, Npm, CI/CD Gitlab, Agile, Scrum, Kanban, Jira</w:t>
             </w:r>
             <w:bookmarkEnd w:id="4"/>
           </w:p>
@@ -3527,9 +3834,9 @@
                 <w:u w:val="single"/>
                 <w:lang w:val="en-US"/>
               </w:rPr>
+              <w:lastRenderedPageBreak/>
               <w:t>F</w:t>
             </w:r>
-            <w:proofErr w:type="spellStart"/>
             <w:r>
               <w:rPr>
                 <w:rFonts w:ascii="Montserrat" w:hAnsi="Montserrat"/>
@@ -3542,7 +3849,6 @@
               </w:rPr>
               <w:t>reelance</w:t>
             </w:r>
-            <w:proofErr w:type="spellEnd"/>
             <w:r>
               <w:rPr>
                 <w:rFonts w:ascii="Montserrat" w:hAnsi="Montserrat"/>
@@ -3687,7 +3993,7 @@
               </w:rPr>
               <w:t xml:space="preserve"> </w:t>
             </w:r>
-            <w:hyperlink r:id="rId14" w:history="1">
+            <w:hyperlink r:id="rId16" w:history="1">
               <w:r>
                 <w:rPr>
                   <w:rStyle w:val="a3"/>
@@ -3803,6 +4109,16 @@
               <w:t>Implemented responsive layouts and interactive elements (burger menus, pop-ups, forms with validation)</w:t>
             </w:r>
           </w:p>
+          <w:p>
+            <w:pPr>
+              <w:rPr>
+                <w:rFonts w:ascii="Montserrat" w:hAnsi="Montserrat"/>
+                <w:sz w:val="20"/>
+                <w:szCs w:val="18"/>
+                <w:lang w:val="en-US"/>
+              </w:rPr>
+            </w:pPr>
+          </w:p>
         </w:tc>
       </w:tr>
     </w:tbl>
@@ -3840,6 +4156,17 @@
         </w:rPr>
         <w:t>EDUCATION</w:t>
       </w:r>
+      <w:r>
+        <w:rPr>
+          <w:rFonts w:ascii="Montserrat" w:hAnsi="Montserrat"/>
+          <w:b/>
+          <w:bCs/>
+          <w:sz w:val="28"/>
+          <w:szCs w:val="28"/>
+          <w:lang w:val="en-US"/>
+        </w:rPr>
+        <w:t xml:space="preserve"> (Bachelor's)</w:t>
+      </w:r>
     </w:p>
     <w:p>
       <w:pPr>
@@ -3961,23 +4288,7 @@
           <w:rFonts w:ascii="Montserrat" w:hAnsi="Montserrat"/>
           <w:lang w:val="en-US"/>
         </w:rPr>
-        <w:t xml:space="preserve"> «</w:t>
-      </w:r>
-      <w:proofErr w:type="spellStart"/>
-      <w:r>
-        <w:rPr>
-          <w:rFonts w:ascii="Montserrat" w:hAnsi="Montserrat"/>
-          <w:lang w:val="en-US"/>
-        </w:rPr>
-        <w:t>UpSkill</w:t>
-      </w:r>
-      <w:proofErr w:type="spellEnd"/>
-      <w:r>
-        <w:rPr>
-          <w:rFonts w:ascii="Montserrat" w:hAnsi="Montserrat"/>
-          <w:lang w:val="en-US"/>
-        </w:rPr>
-        <w:t xml:space="preserve"> Me»</w:t>
+        <w:t xml:space="preserve"> «UpSkill Me»</w:t>
       </w:r>
       <w:r>
         <w:rPr>
@@ -4134,7 +4445,6 @@
           <w:szCs w:val="28"/>
           <w:lang w:val="en-US"/>
         </w:rPr>
-        <w:lastRenderedPageBreak/>
         <w:t>SKILLS</w:t>
       </w:r>
     </w:p>
@@ -4152,90 +4462,7 @@
           <w:rFonts w:ascii="Montserrat" w:hAnsi="Montserrat"/>
           <w:lang w:val="en-US"/>
         </w:rPr>
-        <w:t xml:space="preserve">HTML5, CSS3 (SCSS, SASS, LESS), JavaScript, Angular 2+, TypeScript, </w:t>
-      </w:r>
-      <w:proofErr w:type="spellStart"/>
-      <w:r>
-        <w:rPr>
-          <w:rFonts w:ascii="Montserrat" w:hAnsi="Montserrat"/>
-          <w:lang w:val="en-US"/>
-        </w:rPr>
-        <w:t>RxJS</w:t>
-      </w:r>
-      <w:proofErr w:type="spellEnd"/>
-      <w:r>
-        <w:rPr>
-          <w:rFonts w:ascii="Montserrat" w:hAnsi="Montserrat"/>
-          <w:lang w:val="en-US"/>
-        </w:rPr>
-        <w:t xml:space="preserve">, </w:t>
-      </w:r>
-      <w:proofErr w:type="spellStart"/>
-      <w:r>
-        <w:rPr>
-          <w:rFonts w:ascii="Montserrat" w:hAnsi="Montserrat"/>
-          <w:lang w:val="en-US"/>
-        </w:rPr>
-        <w:t>NgRX</w:t>
-      </w:r>
-      <w:proofErr w:type="spellEnd"/>
-      <w:r>
-        <w:rPr>
-          <w:rFonts w:ascii="Montserrat" w:hAnsi="Montserrat"/>
-          <w:lang w:val="en-US"/>
-        </w:rPr>
-        <w:t>, Angular Material, WebSocket</w:t>
-      </w:r>
-      <w:r>
-        <w:rPr>
-          <w:rFonts w:ascii="Montserrat" w:hAnsi="Montserrat"/>
-          <w:lang w:val="en-US"/>
-        </w:rPr>
-        <w:t xml:space="preserve">, </w:t>
-      </w:r>
-      <w:r>
-        <w:rPr>
-          <w:rFonts w:ascii="Montserrat" w:hAnsi="Montserrat"/>
-          <w:lang w:val="en-US"/>
-        </w:rPr>
-        <w:t xml:space="preserve">Git, Webpack, GitLab CI/CD, Swagger, </w:t>
-      </w:r>
-      <w:proofErr w:type="spellStart"/>
-      <w:r>
-        <w:rPr>
-          <w:rFonts w:ascii="Montserrat" w:hAnsi="Montserrat"/>
-          <w:lang w:val="en-US"/>
-        </w:rPr>
-        <w:t>Npm</w:t>
-      </w:r>
-      <w:proofErr w:type="spellEnd"/>
-      <w:r>
-        <w:rPr>
-          <w:rFonts w:ascii="Montserrat" w:hAnsi="Montserrat"/>
-          <w:lang w:val="en-US"/>
-        </w:rPr>
-        <w:t xml:space="preserve">, </w:t>
-      </w:r>
-      <w:r>
-        <w:rPr>
-          <w:rFonts w:ascii="Montserrat" w:hAnsi="Montserrat"/>
-          <w:lang w:val="en-US"/>
-        </w:rPr>
-        <w:t>BEM, OOP, SOLID, FIRST, Agile (Scrum, Kanban)</w:t>
-      </w:r>
-      <w:r>
-        <w:rPr>
-          <w:rFonts w:ascii="Montserrat" w:hAnsi="Montserrat"/>
-          <w:lang w:val="en-US"/>
-        </w:rPr>
-        <w:t xml:space="preserve">, </w:t>
-      </w:r>
-      <w:r>
-        <w:rPr>
-          <w:rFonts w:ascii="Montserrat" w:hAnsi="Montserrat"/>
-          <w:lang w:val="en-US"/>
-        </w:rPr>
-        <w:t>Figma, Photoshop</w:t>
+        <w:t>HTML5, CSS3, JavaScript, TypeScript, Angular 2+, Angular Material, React, Next.js, RxJS, NgRX, Redux Toolkit / RTK Query, Zod, WebSocket, Swagger, MSW, SCSS, Tailwind CSS, SVGR, next-intl, Vitest, Jest, React Testing Library, Git, Vite, Webpack, Npm, GitLab CI/CD, Accessibility (a11y), Web Performance, Figma, Photoshop, Claude, Cursor, BEM, OOP, SOLID, FIRST, FSD, Agile (Scrum, Kanban)</w:t>
       </w:r>
     </w:p>
     <w:p>

</xml_diff>